<commit_message>
fix: remove "mais minutos por dia poupa" claim from S5 page and worksheet
The unsubstantiated comparative ("sessão que mais minutos poupa") was tonally
off — marketing-speak in pedagogical material. The Catarina scenario already
conveys the daily relevance without needing the boast.

- Page Ideia central: drop the bold closing sentence
- Worksheet Nota inicial: drop the same sentence
- Regenerate worksheet DOCX

Resolução do Formador (internal) retains it for now — user's choice whether to
also remove there.

Co-Authored-By: Claude Opus 4.7 (1M context) <noreply@anthropic.com>
</commit_message>
<xml_diff>
--- a/sessoes/sessao-05/Worksheet_S05_Outlook_Teams.docx
+++ b/sessoes/sessao-05/Worksheet_S05_Outlook_Teams.docx
@@ -108,23 +108,7 @@
         <w:t xml:space="preserve"> </w:t>
       </w:r>
       <w:r>
-        <w:t xml:space="preserve">do dia-a-dia em IES: chega-te uma cadeia de e-mails que cresceu durante uma semana, ou uma transcrição de reunião com decisões dispersas, e tens 1 hora para sintetizar e propor próximos passos.</w:t>
-      </w:r>
-      <w:r>
-        <w:t xml:space="preserve"> </w:t>
-      </w:r>
-      <w:r>
-        <w:rPr>
-          <w:b/>
-          <w:bCs/>
-        </w:rPr>
-        <w:t xml:space="preserve">Esta é a sessão que mais minutos por dia te poupa.</w:t>
-      </w:r>
-      <w:r>
-        <w:t xml:space="preserve"> </w:t>
-      </w:r>
-      <w:r>
-        <w:t xml:space="preserve">Lê o</w:t>
+        <w:t xml:space="preserve">do dia-a-dia em IES: chega-te uma cadeia de e-mails que cresceu durante uma semana, ou uma transcrição de reunião com decisões dispersas, e tens 1 hora para sintetizar e propor próximos passos. Lê o</w:t>
       </w:r>
       <w:r>
         <w:t xml:space="preserve"> </w:t>

</xml_diff>